<commit_message>
Batch 19 — v2.1 classifier-corrected panel rerun (v1.0.0-rc3): manuscript/supplement/Table_S4_wild_bootstrap.docx
</commit_message>
<xml_diff>
--- a/manuscript/supplement/Table_S4_wild_bootstrap.docx
+++ b/manuscript/supplement/Table_S4_wild_bootstrap.docx
@@ -220,7 +220,7 @@
                 <w:rFonts w:ascii="Arial" w:hAnsi="Arial"/>
                 <w:sz w:val="20"/>
               </w:rPr>
-              <w:t>999</w:t>
+              <w:t>9999</w:t>
             </w:r>
           </w:p>
         </w:tc>
@@ -234,7 +234,7 @@
                 <w:rFonts w:ascii="Arial" w:hAnsi="Arial"/>
                 <w:sz w:val="20"/>
               </w:rPr>
-              <w:t>0.3710</w:t>
+              <w:t>0.4000</w:t>
             </w:r>
           </w:p>
         </w:tc>
@@ -248,7 +248,7 @@
                 <w:rFonts w:ascii="Arial" w:hAnsi="Arial"/>
                 <w:sz w:val="20"/>
               </w:rPr>
-              <w:t>-54.021</w:t>
+              <w:t>nan</w:t>
             </w:r>
           </w:p>
         </w:tc>
@@ -262,7 +262,7 @@
                 <w:rFonts w:ascii="Arial" w:hAnsi="Arial"/>
                 <w:sz w:val="20"/>
               </w:rPr>
-              <w:t>84.599</w:t>
+              <w:t>nan</w:t>
             </w:r>
           </w:p>
         </w:tc>
@@ -334,7 +334,7 @@
                 <w:rFonts w:ascii="Arial" w:hAnsi="Arial"/>
                 <w:sz w:val="20"/>
               </w:rPr>
-              <w:t>999</w:t>
+              <w:t>9999</w:t>
             </w:r>
           </w:p>
         </w:tc>
@@ -348,7 +348,7 @@
                 <w:rFonts w:ascii="Arial" w:hAnsi="Arial"/>
                 <w:sz w:val="20"/>
               </w:rPr>
-              <w:t>0.2390</w:t>
+              <w:t>0.2293</w:t>
             </w:r>
           </w:p>
         </w:tc>
@@ -362,7 +362,7 @@
                 <w:rFonts w:ascii="Arial" w:hAnsi="Arial"/>
                 <w:sz w:val="20"/>
               </w:rPr>
-              <w:t>-15.114</w:t>
+              <w:t>nan</w:t>
             </w:r>
           </w:p>
         </w:tc>
@@ -376,7 +376,7 @@
                 <w:rFonts w:ascii="Arial" w:hAnsi="Arial"/>
                 <w:sz w:val="20"/>
               </w:rPr>
-              <w:t>7.941</w:t>
+              <w:t>nan</w:t>
             </w:r>
           </w:p>
         </w:tc>
@@ -448,7 +448,7 @@
                 <w:rFonts w:ascii="Arial" w:hAnsi="Arial"/>
                 <w:sz w:val="20"/>
               </w:rPr>
-              <w:t>999</w:t>
+              <w:t>9999</w:t>
             </w:r>
           </w:p>
         </w:tc>
@@ -462,7 +462,7 @@
                 <w:rFonts w:ascii="Arial" w:hAnsi="Arial"/>
                 <w:sz w:val="20"/>
               </w:rPr>
-              <w:t>0.2050</w:t>
+              <w:t>0.2047</w:t>
             </w:r>
           </w:p>
         </w:tc>
@@ -476,7 +476,7 @@
                 <w:rFonts w:ascii="Arial" w:hAnsi="Arial"/>
                 <w:sz w:val="20"/>
               </w:rPr>
-              <w:t>-0.000</w:t>
+              <w:t>nan</w:t>
             </w:r>
           </w:p>
         </w:tc>
@@ -490,7 +490,7 @@
                 <w:rFonts w:ascii="Arial" w:hAnsi="Arial"/>
                 <w:sz w:val="20"/>
               </w:rPr>
-              <w:t>0.000</w:t>
+              <w:t>nan</w:t>
             </w:r>
           </w:p>
         </w:tc>
@@ -534,7 +534,7 @@
                 <w:rFonts w:ascii="Arial" w:hAnsi="Arial"/>
                 <w:sz w:val="20"/>
               </w:rPr>
-              <w:t>+15.289</w:t>
+              <w:t>+15.218</w:t>
             </w:r>
           </w:p>
         </w:tc>
@@ -548,7 +548,7 @@
                 <w:rFonts w:ascii="Arial" w:hAnsi="Arial"/>
                 <w:sz w:val="20"/>
               </w:rPr>
-              <w:t>0.882</w:t>
+              <w:t>0.878</w:t>
             </w:r>
           </w:p>
         </w:tc>
@@ -562,7 +562,7 @@
                 <w:rFonts w:ascii="Arial" w:hAnsi="Arial"/>
                 <w:sz w:val="20"/>
               </w:rPr>
-              <w:t>999</w:t>
+              <w:t>9999</w:t>
             </w:r>
           </w:p>
         </w:tc>
@@ -576,7 +576,7 @@
                 <w:rFonts w:ascii="Arial" w:hAnsi="Arial"/>
                 <w:sz w:val="20"/>
               </w:rPr>
-              <w:t>0.3710</w:t>
+              <w:t>0.4065</w:t>
             </w:r>
           </w:p>
         </w:tc>
@@ -590,7 +590,7 @@
                 <w:rFonts w:ascii="Arial" w:hAnsi="Arial"/>
                 <w:sz w:val="20"/>
               </w:rPr>
-              <w:t>-54.021</w:t>
+              <w:t>nan</w:t>
             </w:r>
           </w:p>
         </w:tc>
@@ -604,7 +604,7 @@
                 <w:rFonts w:ascii="Arial" w:hAnsi="Arial"/>
                 <w:sz w:val="20"/>
               </w:rPr>
-              <w:t>84.599</w:t>
+              <w:t>nan</w:t>
             </w:r>
           </w:p>
         </w:tc>
@@ -648,7 +648,7 @@
                 <w:rFonts w:ascii="Arial" w:hAnsi="Arial"/>
                 <w:sz w:val="20"/>
               </w:rPr>
-              <w:t>-3.587</w:t>
+              <w:t>-3.623</w:t>
             </w:r>
           </w:p>
         </w:tc>
@@ -662,7 +662,7 @@
                 <w:rFonts w:ascii="Arial" w:hAnsi="Arial"/>
                 <w:sz w:val="20"/>
               </w:rPr>
-              <w:t>-1.245</w:t>
+              <w:t>-1.253</w:t>
             </w:r>
           </w:p>
         </w:tc>
@@ -676,7 +676,7 @@
                 <w:rFonts w:ascii="Arial" w:hAnsi="Arial"/>
                 <w:sz w:val="20"/>
               </w:rPr>
-              <w:t>999</w:t>
+              <w:t>9999</w:t>
             </w:r>
           </w:p>
         </w:tc>
@@ -690,7 +690,7 @@
                 <w:rFonts w:ascii="Arial" w:hAnsi="Arial"/>
                 <w:sz w:val="20"/>
               </w:rPr>
-              <w:t>0.2390</w:t>
+              <w:t>0.2293</w:t>
             </w:r>
           </w:p>
         </w:tc>
@@ -704,7 +704,7 @@
                 <w:rFonts w:ascii="Arial" w:hAnsi="Arial"/>
                 <w:sz w:val="20"/>
               </w:rPr>
-              <w:t>-15.114</w:t>
+              <w:t>nan</w:t>
             </w:r>
           </w:p>
         </w:tc>
@@ -718,7 +718,7 @@
                 <w:rFonts w:ascii="Arial" w:hAnsi="Arial"/>
                 <w:sz w:val="20"/>
               </w:rPr>
-              <w:t>7.941</w:t>
+              <w:t>nan</w:t>
             </w:r>
           </w:p>
         </w:tc>
@@ -762,7 +762,7 @@
                 <w:rFonts w:ascii="Arial" w:hAnsi="Arial"/>
                 <w:sz w:val="20"/>
               </w:rPr>
-              <w:t>+0.000</w:t>
+              <w:t>-0.098</w:t>
             </w:r>
           </w:p>
         </w:tc>
@@ -776,7 +776,7 @@
                 <w:rFonts w:ascii="Arial" w:hAnsi="Arial"/>
                 <w:sz w:val="20"/>
               </w:rPr>
-              <w:t>1.029</w:t>
+              <w:t>-1.589</w:t>
             </w:r>
           </w:p>
         </w:tc>
@@ -790,7 +790,7 @@
                 <w:rFonts w:ascii="Arial" w:hAnsi="Arial"/>
                 <w:sz w:val="20"/>
               </w:rPr>
-              <w:t>999</w:t>
+              <w:t>9999</w:t>
             </w:r>
           </w:p>
         </w:tc>
@@ -804,7 +804,7 @@
                 <w:rFonts w:ascii="Arial" w:hAnsi="Arial"/>
                 <w:sz w:val="20"/>
               </w:rPr>
-              <w:t>0.2050</w:t>
+              <w:t>0.1570</w:t>
             </w:r>
           </w:p>
         </w:tc>
@@ -818,7 +818,7 @@
                 <w:rFonts w:ascii="Arial" w:hAnsi="Arial"/>
                 <w:sz w:val="20"/>
               </w:rPr>
-              <w:t>-0.000</w:t>
+              <w:t>nan</w:t>
             </w:r>
           </w:p>
         </w:tc>
@@ -832,7 +832,7 @@
                 <w:rFonts w:ascii="Arial" w:hAnsi="Arial"/>
                 <w:sz w:val="20"/>
               </w:rPr>
-              <w:t>0.000</w:t>
+              <w:t>nan</w:t>
             </w:r>
           </w:p>
         </w:tc>

</xml_diff>